<commit_message>
fix: РСХД lab3 report fix
</commit_message>
<xml_diff>
--- a/РСХД/Лаб3/P3331_P3332_Исупов_Никита_Александрович_Ястребов-Амирханов_Алекси_ЛР3.pdf.docx
+++ b/РСХД/Лаб3/P3331_P3332_Исупов_Никита_Александрович_Ястребов-Амирханов_Алекси_ЛР3.pdf.docx
@@ -4073,6 +4073,56 @@
                 <w:szCs w:val="28"/>
                 <w:lang w:val="en-US"/>
               </w:rPr>
+              <w:t xml:space="preserve"> mount "C:\Users\AsusAspire 3\Desktop\MOUNT\</w:t>
+            </w:r>
+            <w:proofErr w:type="spellStart"/>
+            <w:r>
+              <w:rPr>
+                <w:rFonts w:ascii="Times New Roman" w:hAnsi="Times New Roman" w:cs="Times New Roman"/>
+                <w:sz w:val="28"/>
+                <w:szCs w:val="28"/>
+                <w:lang w:val="en-US"/>
+              </w:rPr>
+              <w:t>mountpointPRIMARY</w:t>
+            </w:r>
+            <w:proofErr w:type="spellEnd"/>
+            <w:r>
+              <w:rPr>
+                <w:rFonts w:ascii="Times New Roman" w:hAnsi="Times New Roman" w:cs="Times New Roman"/>
+                <w:sz w:val="28"/>
+                <w:szCs w:val="28"/>
+                <w:lang w:val="en-US"/>
+              </w:rPr>
+              <w:t>" primary:/home/ubuntu/mountpoint</w:t>
+            </w:r>
+          </w:p>
+          <w:p>
+            <w:pPr>
+              <w:rPr>
+                <w:rFonts w:ascii="Times New Roman" w:hAnsi="Times New Roman" w:cs="Times New Roman"/>
+                <w:sz w:val="28"/>
+                <w:szCs w:val="28"/>
+                <w:lang w:val="en-US"/>
+              </w:rPr>
+            </w:pPr>
+            <w:proofErr w:type="spellStart"/>
+            <w:r>
+              <w:rPr>
+                <w:rFonts w:ascii="Times New Roman" w:hAnsi="Times New Roman" w:cs="Times New Roman"/>
+                <w:sz w:val="28"/>
+                <w:szCs w:val="28"/>
+                <w:lang w:val="en-US"/>
+              </w:rPr>
+              <w:t>multipass</w:t>
+            </w:r>
+            <w:proofErr w:type="spellEnd"/>
+            <w:r>
+              <w:rPr>
+                <w:rFonts w:ascii="Times New Roman" w:hAnsi="Times New Roman" w:cs="Times New Roman"/>
+                <w:sz w:val="28"/>
+                <w:szCs w:val="28"/>
+                <w:lang w:val="en-US"/>
+              </w:rPr>
               <w:t xml:space="preserve"> mount "</w:t>
             </w:r>
             <w:r>
@@ -4080,14 +4130,6 @@
                 <w:rFonts w:ascii="Times New Roman" w:hAnsi="Times New Roman" w:cs="Times New Roman"/>
                 <w:sz w:val="28"/>
                 <w:szCs w:val="28"/>
-              </w:rPr>
-              <w:t xml:space="preserve"> </w:t>
-            </w:r>
-            <w:r>
-              <w:rPr>
-                <w:rFonts w:ascii="Times New Roman" w:hAnsi="Times New Roman" w:cs="Times New Roman"/>
-                <w:sz w:val="28"/>
-                <w:szCs w:val="28"/>
                 <w:lang w:val="en-US"/>
               </w:rPr>
               <w:t>C:\Users\AsusAspire 3\Desktop\MOUNT\</w:t>
@@ -4100,17 +4142,26 @@
                 <w:szCs w:val="28"/>
                 <w:lang w:val="en-US"/>
               </w:rPr>
-              <w:t>mountpointPRIMARY</w:t>
-            </w:r>
-            <w:proofErr w:type="spellEnd"/>
-            <w:r>
-              <w:rPr>
-                <w:rFonts w:ascii="Times New Roman" w:hAnsi="Times New Roman" w:cs="Times New Roman"/>
-                <w:sz w:val="28"/>
-                <w:szCs w:val="28"/>
-                <w:lang w:val="en-US"/>
-              </w:rPr>
-              <w:t>" primary:/home/ubuntu/mountpoint</w:t>
+              <w:t>mountpointSTANDBY</w:t>
+            </w:r>
+            <w:proofErr w:type="spellEnd"/>
+            <w:r>
+              <w:rPr>
+                <w:rFonts w:ascii="Times New Roman" w:hAnsi="Times New Roman" w:cs="Times New Roman"/>
+                <w:sz w:val="28"/>
+                <w:szCs w:val="28"/>
+                <w:lang w:val="en-US"/>
+              </w:rPr>
+              <w:t>" standby:/home/ubuntu/</w:t>
+            </w:r>
+            <w:r>
+              <w:rPr>
+                <w:rFonts w:ascii="Times New Roman" w:hAnsi="Times New Roman" w:cs="Times New Roman"/>
+                <w:sz w:val="28"/>
+                <w:szCs w:val="28"/>
+                <w:lang w:val="en-US"/>
+              </w:rPr>
+              <w:t>mountpoint</w:t>
             </w:r>
           </w:p>
           <w:p>
@@ -4149,75 +4200,7 @@
                 <w:szCs w:val="28"/>
                 <w:lang w:val="en-US"/>
               </w:rPr>
-              <w:t xml:space="preserve"> C:\Users\AsusAspire 3\Desktop\MOUNT\</w:t>
-            </w:r>
-            <w:proofErr w:type="spellStart"/>
-            <w:r>
-              <w:rPr>
-                <w:rFonts w:ascii="Times New Roman" w:hAnsi="Times New Roman" w:cs="Times New Roman"/>
-                <w:sz w:val="28"/>
-                <w:szCs w:val="28"/>
-                <w:lang w:val="en-US"/>
-              </w:rPr>
-              <w:t>mountpointSTANDBY</w:t>
-            </w:r>
-            <w:proofErr w:type="spellEnd"/>
-            <w:r>
-              <w:rPr>
-                <w:rFonts w:ascii="Times New Roman" w:hAnsi="Times New Roman" w:cs="Times New Roman"/>
-                <w:sz w:val="28"/>
-                <w:szCs w:val="28"/>
-                <w:lang w:val="en-US"/>
-              </w:rPr>
-              <w:t>" standby:/home/ubuntu/</w:t>
-            </w:r>
-            <w:r>
-              <w:rPr>
-                <w:rFonts w:ascii="Times New Roman" w:hAnsi="Times New Roman" w:cs="Times New Roman"/>
-                <w:sz w:val="28"/>
-                <w:szCs w:val="28"/>
-                <w:lang w:val="en-US"/>
-              </w:rPr>
-              <w:t>mountpoint</w:t>
-            </w:r>
-          </w:p>
-          <w:p>
-            <w:pPr>
-              <w:rPr>
-                <w:rFonts w:ascii="Times New Roman" w:hAnsi="Times New Roman" w:cs="Times New Roman"/>
-                <w:sz w:val="28"/>
-                <w:szCs w:val="28"/>
-                <w:lang w:val="en-US"/>
-              </w:rPr>
-            </w:pPr>
-            <w:proofErr w:type="spellStart"/>
-            <w:r>
-              <w:rPr>
-                <w:rFonts w:ascii="Times New Roman" w:hAnsi="Times New Roman" w:cs="Times New Roman"/>
-                <w:sz w:val="28"/>
-                <w:szCs w:val="28"/>
-                <w:lang w:val="en-US"/>
-              </w:rPr>
-              <w:t>multipass</w:t>
-            </w:r>
-            <w:proofErr w:type="spellEnd"/>
-            <w:r>
-              <w:rPr>
-                <w:rFonts w:ascii="Times New Roman" w:hAnsi="Times New Roman" w:cs="Times New Roman"/>
-                <w:sz w:val="28"/>
-                <w:szCs w:val="28"/>
-                <w:lang w:val="en-US"/>
-              </w:rPr>
-              <w:t xml:space="preserve"> mount "</w:t>
-            </w:r>
-            <w:r>
-              <w:rPr>
-                <w:rFonts w:ascii="Times New Roman" w:hAnsi="Times New Roman" w:cs="Times New Roman"/>
-                <w:sz w:val="28"/>
-                <w:szCs w:val="28"/>
-                <w:lang w:val="en-US"/>
-              </w:rPr>
-              <w:t xml:space="preserve"> C:\Users\AsusAspire 3\Desktop\MOUNT\</w:t>
+              <w:t>C:\Users\AsusAspire 3\Desktop\MOUNT\</w:t>
             </w:r>
             <w:proofErr w:type="spellStart"/>
             <w:r>
@@ -24808,28 +24791,28 @@
 </file>
 
 <file path=customXml/item1.xml><?xml version="1.0" encoding="utf-8"?>
+<b:Sources xmlns:b="http://schemas.openxmlformats.org/officeDocument/2006/bibliography" xmlns="http://schemas.openxmlformats.org/officeDocument/2006/bibliography" SelectedStyle="\APASixthEditionOfficeOnline.xsl" StyleName="APA" Version="6"/>
+</file>
+
+<file path=customXml/item2.xml><?xml version="1.0" encoding="utf-8"?>
 <go:gDocsCustomXmlDataStorage xmlns:go="http://customooxmlschemas.google.com/" xmlns:r="http://schemas.openxmlformats.org/officeDocument/2006/relationships" uri="GoogleDocsCustomDataVersion2">
   <go:docsCustomData xmlns:go="http://customooxmlschemas.google.com/" roundtripDataSignature="AMtx7mjwruTx+Vn/MDAX/44QgQzc+AP2Ag==">CgMxLjAaHwoBMBIaChgICVIUChJ0YWJsZS44OTd0NXlmdTg0cWQaHwoBMRIaChgICVIUChJ0YWJsZS5kczg1cWF0bWl6dm4yDmguMWR4YmM5MTJqNXNhMg5oLnR1aDlyZ2JhaGY0ZDIOaC5nM3g0NWQ4ZmVpZWk4AHIhMUNmRUxpcVc2YnEwSHB1aWZkcDJZSzFENklNNzV4Q3k3</go:docsCustomData>
 </go:gDocsCustomXmlDataStorage>
 </file>
 
-<file path=customXml/item2.xml><?xml version="1.0" encoding="utf-8"?>
-<b:Sources xmlns:b="http://schemas.openxmlformats.org/officeDocument/2006/bibliography" xmlns="http://schemas.openxmlformats.org/officeDocument/2006/bibliography" SelectedStyle="\APASixthEditionOfficeOnline.xsl" StyleName="APA" Version="6"/>
+<file path=customXml/itemProps1.xml><?xml version="1.0" encoding="utf-8"?>
+<ds:datastoreItem xmlns:ds="http://schemas.openxmlformats.org/officeDocument/2006/customXml" ds:itemID="{34F984A3-66A3-43B7-A0AA-61F4BAE2E3FF}">
+  <ds:schemaRefs>
+    <ds:schemaRef ds:uri="http://schemas.openxmlformats.org/officeDocument/2006/bibliography"/>
+  </ds:schemaRefs>
+</ds:datastoreItem>
 </file>
 
-<file path=customXml/itemProps1.xml><?xml version="1.0" encoding="utf-8"?>
+<file path=customXml/itemProps2.xml><?xml version="1.0" encoding="utf-8"?>
 <ds:datastoreItem xmlns:ds="http://schemas.openxmlformats.org/officeDocument/2006/customXml" ds:itemID="{11111111-1234-1234-1234-123412341234}">
   <ds:schemaRefs>
     <ds:schemaRef ds:uri="http://customooxmlschemas.google.com/"/>
     <ds:schemaRef ds:uri="http://schemas.openxmlformats.org/officeDocument/2006/relationships"/>
   </ds:schemaRefs>
 </ds:datastoreItem>
-</file>
-
-<file path=customXml/itemProps2.xml><?xml version="1.0" encoding="utf-8"?>
-<ds:datastoreItem xmlns:ds="http://schemas.openxmlformats.org/officeDocument/2006/customXml" ds:itemID="{34F984A3-66A3-43B7-A0AA-61F4BAE2E3FF}">
-  <ds:schemaRefs>
-    <ds:schemaRef ds:uri="http://schemas.openxmlformats.org/officeDocument/2006/bibliography"/>
-  </ds:schemaRefs>
-</ds:datastoreItem>
 </file>
</xml_diff>